<commit_message>
fix: update gaps errors
</commit_message>
<xml_diff>
--- a/docs/AI-Diffusion-DPG-Technical-Specification.docx
+++ b/docs/AI-Diffusion-DPG-Technical-Specification.docx
@@ -470,7 +470,7 @@
     </w:p>
     <w:p>
       <w:r>
-        <w:t>Kaam Ki Baat (KKB) is the canonical reference domain. It is a labour-market assistant for informal workers, accessed via voice (dial 5226), web, and CLI. KKB exercises the full block matrix: a Conversational agent with a multi-subagent workflow, NLU-driven routing, ChromaDB-backed retrieval over five reference documents, REST connectors for ONEST job postings, DPDP-compliant consent gating, and the dignity-check guardrail. Section 6 walks through a single KKB turn end to end.</w:t>
+        <w:t>Kaam Ki Baat (KKB) is the canonical reference domain. It is a labour-market assistant for informal workers, accessed via voice (the dial number is configured per deployment in channels.voice.dial_number), web, and CLI. KKB exercises the full block matrix: a Conversational agent with a multi-subagent workflow, NLU-driven routing, ChromaDB-backed retrieval over five reference documents, REST connectors for ONEST job postings, DPDP-compliant consent gating, and the dignity-check guardrail. Section 6 walks through a single KKB turn end to end.</w:t>
       </w:r>
     </w:p>
     <w:p>
@@ -561,7 +561,7 @@
     </w:p>
     <w:p>
       <w:r>
-        <w:t>Only Agent Core initiates calls to other blocks. No other block initiates a cross-block call. The framework enforces this invariant by code review and by service-level network policy in production deployments. Action Gateway is the sole route to external systems; Knowledge Engine is the sole route for prompt assembly; Memory Layer is the sole route for state. There is one approved, scoped exception: the Reach Layer web channel calls Memory Layer's GET /users/{user_id}/active-history directly to restore chat history before the first turn. This exception is documented and applies only to the dev/demo web adapter; future production channel adapters route state retrieval through Agent Core.</w:t>
+        <w:t>Only Agent Core initiates calls to other blocks. No other block initiates a cross-block call. The framework enforces this invariant by code review and by service-level network policy in production deployments. Action Gateway is the sole route to external systems; Knowledge Engine is the sole route for retrieval; prompt assembly itself happens inside Agent Core's Manager Agent; Memory Layer is the sole route for state. Two production-approved direct calls sit outside the turn pipeline: the Reach Layer web channel calls Memory Layer's GET /users/{user_id}/active-history directly to restore chat history before turn 1, and Reach Layer's POST /ingest forwards user-uploaded documents straight to Knowledge Engine before the first turn. This exception is documented and applies only to the dev/demo web adapter; future production channel adapters route state retrieval through Agent Core.</w:t>
       </w:r>
     </w:p>
     <w:p>
@@ -613,7 +613,7 @@
           <w:color w:val="555555"/>
           <w:sz w:val="18"/>
         </w:rPr>
-        <w:t>Figure 3.2 — Caller → callee matrix and the approved Reach-web exception.</w:t>
+        <w:t>Figure 3.2 — Module call matrix: turn-time orchestration plus approved/planned direct calls.</w:t>
       </w:r>
     </w:p>
     <w:p>
@@ -678,7 +678,7 @@
           <w:color w:val="555555"/>
           <w:sz w:val="18"/>
         </w:rPr>
-        <w:t>Figure 3.3 — Synchronous turn sequence (POST /process_turn).</w:t>
+        <w:t>Figure 3.3 — Synchronous turn sequence (POST /process_turn). Manager Agent builds the system prompt; Knowledge Engine is invoked via the knowledge_retrieval tool.</w:t>
       </w:r>
     </w:p>
     <w:p>
@@ -730,7 +730,7 @@
           <w:color w:val="555555"/>
           <w:sz w:val="18"/>
         </w:rPr>
-        <w:t>Figure 3.4 — Streaming turn sequence with TurnAssembler and barge-in.</w:t>
+        <w:t>Figure 3.4 — Streaming turn sequence (POST /stream_turn): TurnAssembler segment buffering, full pipeline (memory → trust input → NLU → constraints → prompt build → LLM → tools → per-sentence trust output), SSE events, and barge-in.</w:t>
       </w:r>
     </w:p>
     <w:p>
@@ -774,7 +774,7 @@
     </w:p>
     <w:p>
       <w:r>
-        <w:t>Agent Core is the sole orchestrator and the sole LLM caller. It runs language normalisation and NLU internally before calling any other block, builds the system prompt by combining the active subagent prompt with Trust-Layer-supplied constraints and disclosures, executes the bounded tool-use loop, performs the post-LLM safety check, and dispatches asynchronous writes to Memory Layer and Observability Layer after the response has been delivered. It is stateless between turns; any instance can handle any session.</w:t>
+        <w:t>Agent Core is the turn-time orchestrator and the sole LLM caller. It runs language normalisation and NLU internally before calling any other block, builds the system prompt by combining the active subagent prompt with Trust-Layer-supplied constraints and disclosures, executes the bounded tool-use loop, performs the post-LLM safety check, and dispatches asynchronous writes to Memory Layer and Observability Layer after the response has been delivered. It is stateless between turns; any instance can handle any session.</w:t>
       </w:r>
     </w:p>
     <w:p>
@@ -1156,7 +1156,7 @@
     </w:p>
     <w:p>
       <w:r>
-        <w:t>Knowledge Engine assembles the full LLM prompt from NLU results and session state passed in the request body. It is stateless and never calls Memory Layer directly. Internal components are: Glossary and Domain Vocabulary, Static Knowledge Base (semantic RAG over ChromaDB), and a Multimodal Input Handler (disabled in current configurations). Retrieval is invoked by the LLM as an internal tool named knowledge_retrieval; subagents whose tool list does not include this tool never trigger a KE call.</w:t>
+        <w:t>Knowledge Engine returns ranked retrieval chunks based on NLU results and session state passed in the request body. The final system prompt is assembled by Agent Core's Manager Agent (subagent prompt + Trust constraints + required disclosures + KE chunks). Knowledge Engine is stateless on the retrieval path and never calls Memory Layer. Internal components are: Glossary and Domain Vocabulary, Static Knowledge Base (semantic RAG over ChromaDB), and a Multimodal Input Handler (disabled in current configurations). Retrieval is invoked by the LLM as an internal tool named knowledge_retrieval; subagents whose tool list does not include this tool never trigger a KE call.</w:t>
       </w:r>
     </w:p>
     <w:p>
@@ -1208,7 +1208,7 @@
           <w:color w:val="555555"/>
           <w:sz w:val="18"/>
         </w:rPr>
-        <w:t>Figure 4.3 — Knowledge Engine prompt assembly.</w:t>
+        <w:t>Figure 4.3 — Knowledge Engine retrieval pipeline and ingestion ledger (chunks out — final prompt assembled in Agent Core).</w:t>
       </w:r>
     </w:p>
     <w:p>
@@ -1418,7 +1418,7 @@
           <w:color w:val="555555"/>
           <w:sz w:val="18"/>
         </w:rPr>
-        <w:t>Figure 4.6 — Tool execution loop.</w:t>
+        <w:t>Figure 4.6 — Tool execution loop: ToolRegistry routes knowledge_retrieval to Knowledge Engine and all other tools to Action Gateway.</w:t>
       </w:r>
     </w:p>
     <w:p>
@@ -1441,7 +1441,7 @@
     </w:p>
     <w:p>
       <w:r>
-        <w:t>Two assembly modes are supported. session mode (CLI, Voice) submits via POST /sessions/{id}/input and streams via GET /sessions/{id}/events. direct mode (Web) submits via POST /process_turn and receives the synchronous TurnResult. The Web channel additionally supports a routing_only configuration for voice-only deployments, where the SPA presents a click-to-call surface and hands off to the voice channel without running its own chat session.</w:t>
+        <w:t>Two assembly modes are supported. Channel and assembly mode are independent. session mode submits via POST /sessions/{id}/input and streams via GET /sessions/{id}/events; it is required only when input arrives as partial segments (Voice). direct mode submits via POST /process_turn and receives the synchronous TurnResult; it is the default for CLI and Web. Web is configurable to either mode; Voice is constrained to session mode by VAD-driven input. The Web channel additionally supports a routing_only configuration for voice-only deployments, where the SPA presents a click-to-call surface and hands off to the voice channel without running its own chat session.</w:t>
       </w:r>
     </w:p>
     <w:p>
@@ -2093,12 +2093,12 @@
           <w:color w:val="555555"/>
           <w:sz w:val="18"/>
         </w:rPr>
-        <w:t>Figure 6.1 — KKB single-turn walkthrough.</w:t>
+        <w:t>Figure 6.1 — KKB single-turn walkthrough. Manager Agent assembles the system prompt; KE only enters when the LLM emits a knowledge_retrieval tool_use.</w:t>
       </w:r>
     </w:p>
     <w:p>
       <w:r>
-        <w:t>Voice transport receives audio frames, the pipecat VAD detects an utterance boundary, Raya STT transcribes it, and the AgentCoreLLM frame processor opens an SSE turn against Agent Core. Memory Layer returns the cached session state (user_id, consent: verified). Agent Core runs NLU — intent: balance_enquiry, no entities — and Trust Layer's input check passes (no PII, on-topic). Knowledge Engine assembles the prompt: persona + glossary + RAG snippets covering account explanations. The first LLM call returns a tool_use block invoking get_account_balance; Agent Core's consent gate confirms the read connector needs no further verification, the Action Gateway dispatches the REST call, and the normalised result feeds a second LLM call. The reply is checked by Trust Layer's output gate, the TTS sanitizer rewrites the rupee figure into spoken form, Raya TTS synthesises audio, and the user hears the result. After the response is delivered, Agent Core fires the asynchronous Memory write and Observability emit; neither blocks the user-facing path.</w:t>
+        <w:t>Voice transport receives audio frames, the pipecat VAD detects an utterance boundary, Raya STT transcribes it, and the AgentCoreLLM frame processor opens an SSE turn against Agent Core. Memory Layer returns the cached session state (user_id, consent: verified). Agent Core runs NLU — intent: balance_enquiry, no entities — and Trust Layer's input check passes (no PII, on-topic). Agent Core's Manager Agent assembles the system prompt (persona + Trust constraints + required disclosures); Knowledge Engine returns glossary mappings and RAG snippets covering account explanations when the LLM invokes the knowledge_retrieval tool. The first LLM call returns a tool_use block invoking get_account_balance; Agent Core's consent gate confirms the read connector needs no further verification, the Action Gateway dispatches the REST call, and the normalised result feeds a second LLM call. The reply is checked by Trust Layer's output gate, the TTS sanitizer rewrites the rupee figure into spoken form, Raya TTS synthesises audio, and the user hears the result. After the response is delivered, Agent Core fires the asynchronous Memory write and Observability emit; neither blocks the user-facing path.</w:t>
       </w:r>
     </w:p>
     <w:p>
@@ -2150,7 +2150,7 @@
     </w:p>
     <w:p>
       <w:r>
-        <w:t>The 800–1200 ms voice target is met by the following stage budget: 80 ms for Memory read, 30 ms for Trust input check, 100 ms for NLU on a small model, 60 ms for prompt assembly (Knowledge Engine), 500–800 ms for the main LLM call, 30 ms for Trust output check, and the remainder absorbed by transport and TTS. Tool turns add one more LLM round-trip and an Action Gateway call (target 200 ms), pushing the worst case toward 1500 ms; voice surfaces this with a filler phrase from the active subagent's opening_phrase or a configured wait phrase. Memory and Observability writes are async and outside the budget.</w:t>
+        <w:t>The 800–1200 ms voice target is met by the following stage budget: 80 ms for Memory read, 30 ms for Trust input check, 100 ms for NLU on a small model, 60 ms for retrieval (Knowledge Engine) and prompt assembly (Agent Core's Manager Agent), 500–800 ms for the main LLM call, 30 ms for Trust output check, and the remainder absorbed by transport and TTS. Tool turns add one more LLM round-trip and an Action Gateway call (target 200 ms), pushing the worst case toward 1500 ms; voice surfaces this with a filler phrase from the active subagent's opening_phrase or a configured wait phrase. Memory and Observability writes are async and outside the budget.</w:t>
       </w:r>
     </w:p>
     <w:p>
@@ -2309,7 +2309,7 @@
     </w:p>
     <w:p>
       <w:r>
-        <w:t>automation/helm/ contains the Helm chart for Kubernetes deployment. Each block is a Deployment + Service pair; data services (Redis, Memgraph, ChromaDB) are expected to be managed externally and referenced via configurable URLs. OTel collector, Loki, Jaeger, and Grafana are deployed as sidecars or as a shared observability stack depending on the cluster's existing footprint. Service names use hyphens in Helm (memory-layer); Compose uses underscores (memory_layer). Network policy is expected to enforce the module-interaction rules described in Section 3.2 — only Agent Core may reach the other blocks.</w:t>
+        <w:t>automation/helm/ contains the Helm chart for Kubernetes deployment. Each block is a Deployment + Service pair; data services (Redis, Memgraph, ChromaDB) are expected to be managed externally and referenced via configurable URLs. OTel collector, Loki, Jaeger, and Grafana are deployed as sidecars or as a shared observability stack depending on the cluster's existing footprint. Service names use hyphens in Helm (memory-layer); Compose uses underscores (memory_layer). Network policy is expected to enforce the module-interaction rules described in Section 3.2 — Agent Core is the only block that initiates calls during a turn; explicit, approved direct calls outside the turn (e.g. Reach Layer document ingestion, Reach Layer session-restore, planned Action Gateway caching) are documented in Section 3.2.</w:t>
       </w:r>
     </w:p>
     <w:p>
@@ -6896,7 +6896,7 @@
         <w:t xml:space="preserve">Signal mode / direct mode. </w:t>
       </w:r>
       <w:r>
-        <w:t>Reach Layer assembly modes; session mode for streaming, direct for sync.</w:t>
+        <w:t>Reach Layer assembly modes; session mode for multi-segment / streaming input (required by Voice), direct mode for whole-utterance / sync input (default for CLI and Web).</w:t>
       </w:r>
     </w:p>
     <w:p>

</xml_diff>